<commit_message>
Erfolg TBC: Ob nah, ob fern, Tiere hab ich gern
Fixes #5

ID 653 - Ob nah, ob fern, Tiere hab ich gern
Beschreibung: Zeigt den Tieren jenseits des Dunklen Portals, wie sehr Ihr sie liebt (/liebe).
</commit_message>
<xml_diff>
--- a/CHANGELOGS/CHANGELOG_v2.3.48.docx
+++ b/CHANGELOGS/CHANGELOG_v2.3.48.docx
@@ -17,7 +17,7 @@
         <w:jc w:val="center"/>
       </w:pPr>
       <w:r>
-        <w:t>Fraktionsabhängige, vollständig lokalisierte Classic-Rare-Erfolgsserie mit Titelbelohnung</w:t>
+        <w:t>Classic-Rare-Serie, vollständig lokalisierte Rare-Namen und zweisprachige Kataloglisten</w:t>
       </w:r>
     </w:p>
     <w:p>
@@ -25,7 +25,7 @@
         <w:jc w:val="center"/>
       </w:pPr>
       <w:r>
-        <w:t>Technischer Changelog zu Datenübernahme, Serienfortschritt, Fraktions-/Client-Gates, Titelsystem, NPC-ID-Lokalisierung und Regressionstests</w:t>
+        <w:t>Technischer Changelog zu Rare-Daten, Serienfortschritt, Titelsystem, NPC-ID-Lokalisierung, Listenexporten, Ordnernormalisierung und Regressionstests</w:t>
       </w:r>
     </w:p>
     <w:p>
@@ -33,7 +33,7 @@
         <w:spacing w:before="160" w:after="160"/>
       </w:pPr>
       <w:r>
-        <w:t>Kernaussage: Die Erkundungskategorie enthält die zweistufige Serie „Einzigartig“ / „Extrem selten“. Die 386 NPC-IDs und ihre Fraktions-/Client-Gates stammen aus AnniversaryAchievementsPlus 1.15. In der Nachkorrektur innerhalb derselben Version v2.3.48 wurden sämtliche sichtbaren Rare-Namen aus dem Achievement-Katalog entfernt und auf stabile RARE_NPC_&lt;NPC-ID&gt;-Lokalisierungsschlüssel umgestellt. Jede der zehn vorhandenen Sprachdateien enthält alle 386 Namen. Beide Stufen registrieren weiterhin dieselben gültigen NPCs; der erste Kill zählt daher parallel für beide Erfolge.</w:t>
+        <w:t>Kernaussage: Version v2.3.48 enthält die zweistufige Classic-Rare-Serie „Einzigartig“ / „Extrem selten“. Alle sichtbaren Rare-Namen werden über stabile NPC-ID-Schlüssel aus den zehn Sprachdateien geladen. Zusätzlich liegen getrennte deutsche und englische Classic-/TBC-Erfolgslisten sowie deutsche und englische Titellisten vor; die Ordner changelogs, documentation und lists sind vollständig kleingeschrieben.</w:t>
       </w:r>
     </w:p>
     <w:tbl>
@@ -237,10 +237,6 @@
           </w:tcPr>
           <w:p>
             <w:r>
-              <w:rPr>
-                <w:rFonts w:ascii="Liberation Sans" w:hAnsi="Liberation Sans"/>
-                <w:sz w:val="17"/>
-              </w:rPr>
               <w:t>651 - Einzigartig; 652 - Extrem selten</w:t>
             </w:r>
           </w:p>
@@ -5822,7 +5818,7 @@
         <w:spacing w:after="60"/>
       </w:pPr>
       <w:r>
-        <w:t>Neue native Achievement-IDs: 651 und 652.</w:t>
+        <w:t>Neue native Achievement-IDs innerhalb v2.3.48: 651 und 652.</w:t>
       </w:r>
     </w:p>
     <w:p>
@@ -5831,7 +5827,7 @@
         <w:spacing w:after="60"/>
       </w:pPr>
       <w:r>
-        <w:t>Neue reservierte Kriterien-ID-Spanne: 2069 bis 2840. Bereits vorhandene TBC-Kriterien endeten bei 2068.</w:t>
+        <w:t>Reservierte Kriterien-IDs: 2069 bis 2840 für die Classic-Rare-Serie.</w:t>
       </w:r>
     </w:p>
     <w:p>
@@ -6160,10 +6156,6 @@
           </w:tcPr>
           <w:p>
             <w:r>
-              <w:rPr>
-                <w:rFonts w:ascii="Liberation Sans" w:hAnsi="Liberation Sans"/>
-                <w:sz w:val="16"/>
-              </w:rPr>
               <w:t>369 Kriterien je Stufe; TBC-Delta und Counter 517/2840 bestanden.</w:t>
             </w:r>
           </w:p>
@@ -6207,10 +6199,6 @@
           </w:tcPr>
           <w:p>
             <w:r>
-              <w:rPr>
-                <w:rFonts w:ascii="Liberation Sans" w:hAnsi="Liberation Sans"/>
-                <w:sz w:val="16"/>
-              </w:rPr>
               <w:t>383 Kriterien je Stufe; TBC-Delta und Counter 517/2840 bestanden.</w:t>
             </w:r>
           </w:p>
@@ -6590,7 +6578,7 @@
                 <w:rFonts w:ascii="Liberation Sans" w:hAnsi="Liberation Sans"/>
                 <w:sz w:val="15"/>
               </w:rPr>
-              <w:t>achievements/Achievements_TBC.lua</w:t>
+              <w:t>util/TitleData.lua</w:t>
             </w:r>
           </w:p>
         </w:tc>
@@ -6611,7 +6599,7 @@
                 <w:rFonts w:ascii="Liberation Sans" w:hAnsi="Liberation Sans"/>
                 <w:sz w:val="15"/>
               </w:rPr>
-              <w:t>Achievement-Counter auf 517 und Kriterien-Counter auf 2840 angehoben.</w:t>
+              <w:t>Stabile Definition builtin.the_elusive ergänzt.</w:t>
             </w:r>
           </w:p>
         </w:tc>
@@ -6637,7 +6625,7 @@
                 <w:rFonts w:ascii="Liberation Sans" w:hAnsi="Liberation Sans"/>
                 <w:sz w:val="15"/>
               </w:rPr>
-              <w:t>util/TitleData.lua</w:t>
+              <w:t>localization/en.lua, de.lua, es.lua, mx.lua</w:t>
             </w:r>
           </w:p>
         </w:tc>
@@ -6654,11 +6642,7 @@
           </w:tcPr>
           <w:p>
             <w:r>
-              <w:rPr>
-                <w:rFonts w:ascii="Liberation Sans" w:hAnsi="Liberation Sans"/>
-                <w:sz w:val="15"/>
-              </w:rPr>
-              <w:t>Stabile Definition builtin.the_elusive ergänzt.</w:t>
+              <w:t>Erfolgsnamen/-texte, Titelformate und jeweils 386 ID-basierte Rare-Namen ergänzt.</w:t>
             </w:r>
           </w:p>
         </w:tc>
@@ -6684,7 +6668,7 @@
                 <w:rFonts w:ascii="Liberation Sans" w:hAnsi="Liberation Sans"/>
                 <w:sz w:val="15"/>
               </w:rPr>
-              <w:t>localization/en.lua, de.lua, es.lua, mx.lua</w:t>
+              <w:t>localization/fr.lua, ko.lua, pt.lua, ru.lua, cn.lua, tw.lua</w:t>
             </w:r>
           </w:p>
         </w:tc>
@@ -6701,7 +6685,7 @@
           </w:tcPr>
           <w:p>
             <w:r>
-              <w:t>Erfolgsnamen/-texte, Titelformate und jeweils 386 ID-basierte Rare-Namen ergänzt.</w:t>
+              <w:t>Erfolgsnamen/-texte, Titelformate und jeweils 386 ID-basierte Rare-Namen in den vorhandenen deaktivierten Übersetzungsdateien ergänzt.</w:t>
             </w:r>
           </w:p>
         </w:tc>
@@ -6727,7 +6711,7 @@
                 <w:rFonts w:ascii="Liberation Sans" w:hAnsi="Liberation Sans"/>
                 <w:sz w:val="15"/>
               </w:rPr>
-              <w:t>localization/fr.lua, ko.lua, pt.lua, ru.lua, cn.lua, tw.lua</w:t>
+              <w:t>AnniversaryAchievements.toc</w:t>
             </w:r>
           </w:p>
         </w:tc>
@@ -6744,7 +6728,11 @@
           </w:tcPr>
           <w:p>
             <w:r>
-              <w:t>Erfolgsnamen/-texte, Titelformate und jeweils 386 ID-basierte Rare-Namen in den vorhandenen deaktivierten Übersetzungsdateien ergänzt.</w:t>
+              <w:rPr>
+                <w:rFonts w:ascii="Liberation Sans" w:hAnsi="Liberation Sans"/>
+                <w:sz w:val="15"/>
+              </w:rPr>
+              <w:t>Version auf v2.3.48 erhöht; Locale-Aktivierung unverändert.</w:t>
             </w:r>
           </w:p>
         </w:tc>
@@ -6770,7 +6758,7 @@
                 <w:rFonts w:ascii="Liberation Sans" w:hAnsi="Liberation Sans"/>
                 <w:sz w:val="15"/>
               </w:rPr>
-              <w:t>AnniversaryAchievements.toc</w:t>
+              <w:t>util/Settings.lua</w:t>
             </w:r>
           </w:p>
         </w:tc>
@@ -6791,7 +6779,7 @@
                 <w:rFonts w:ascii="Liberation Sans" w:hAnsi="Liberation Sans"/>
                 <w:sz w:val="15"/>
               </w:rPr>
-              <w:t>Version auf v2.3.48 erhöht; Locale-Aktivierung unverändert.</w:t>
+              <w:t>Angezeigte Hauptaddon-Version auf v2.3.48 erhöht.</w:t>
             </w:r>
           </w:p>
         </w:tc>
@@ -6817,7 +6805,7 @@
                 <w:rFonts w:ascii="Liberation Sans" w:hAnsi="Liberation Sans"/>
                 <w:sz w:val="15"/>
               </w:rPr>
-              <w:t>util/Settings.lua</w:t>
+              <w:t>api/PublicAPI.lua</w:t>
             </w:r>
           </w:p>
         </w:tc>
@@ -6838,7 +6826,7 @@
                 <w:rFonts w:ascii="Liberation Sans" w:hAnsi="Liberation Sans"/>
                 <w:sz w:val="15"/>
               </w:rPr>
-              <w:t>Angezeigte Hauptaddon-Version auf v2.3.48 erhöht.</w:t>
+              <w:t>Fallback der Hauptaddon-Version auf v2.3.48 erhöht; API 1.4.0 unverändert.</w:t>
             </w:r>
           </w:p>
         </w:tc>
@@ -6864,7 +6852,7 @@
                 <w:rFonts w:ascii="Liberation Sans" w:hAnsi="Liberation Sans"/>
                 <w:sz w:val="15"/>
               </w:rPr>
-              <w:t>api/PublicAPI.lua</w:t>
+              <w:t>CHANGELOG.txt</w:t>
             </w:r>
           </w:p>
         </w:tc>
@@ -6881,11 +6869,7 @@
           </w:tcPr>
           <w:p>
             <w:r>
-              <w:rPr>
-                <w:rFonts w:ascii="Liberation Sans" w:hAnsi="Liberation Sans"/>
-                <w:sz w:val="15"/>
-              </w:rPr>
-              <w:t>Fallback der Hauptaddon-Version auf v2.3.48 erhöht; API 1.4.0 unverändert.</w:t>
+              <w:t>Versionszeile innerhalb v2.3.48 um die NPC-ID-basierte Rare-Namenslokalisierung erweitert.</w:t>
             </w:r>
           </w:p>
         </w:tc>
@@ -6907,54 +6891,7 @@
           </w:tcPr>
           <w:p>
             <w:r>
-              <w:rPr>
-                <w:rFonts w:ascii="Liberation Sans" w:hAnsi="Liberation Sans"/>
-                <w:sz w:val="15"/>
-              </w:rPr>
-              <w:t>CHANGELOG.txt</w:t>
-            </w:r>
-          </w:p>
-        </w:tc>
-        <w:tc>
-          <w:tcPr>
-            <w:tcW w:type="dxa" w:w="7416"/>
-            <w:vAlign w:val="top"/>
-            <w:tcMar>
-              <w:top w:w="90" w:type="dxa"/>
-              <w:start w:w="110" w:type="dxa"/>
-              <w:bottom w:w="90" w:type="dxa"/>
-              <w:end w:w="110" w:type="dxa"/>
-            </w:tcMar>
-          </w:tcPr>
-          <w:p>
-            <w:r>
-              <w:t>Versionszeile innerhalb v2.3.48 um die NPC-ID-basierte Rare-Namenslokalisierung erweitert.</w:t>
-            </w:r>
-          </w:p>
-        </w:tc>
-      </w:tr>
-      <w:tr>
-        <w:trPr>
-          <w:cantSplit/>
-        </w:trPr>
-        <w:tc>
-          <w:tcPr>
-            <w:tcW w:type="dxa" w:w="3816"/>
-            <w:vAlign w:val="top"/>
-            <w:tcMar>
-              <w:top w:w="90" w:type="dxa"/>
-              <w:start w:w="110" w:type="dxa"/>
-              <w:bottom w:w="90" w:type="dxa"/>
-              <w:end w:w="110" w:type="dxa"/>
-            </w:tcMar>
-          </w:tcPr>
-          <w:p>
-            <w:r>
-              <w:rPr>
-                <w:rFonts w:ascii="Liberation Sans" w:hAnsi="Liberation Sans"/>
-                <w:sz w:val="15"/>
-              </w:rPr>
-              <w:t>CHANGELOGS/CHANGELOG_v2.3.48.docx</w:t>
+              <w:t>changelogs/CHANGELOG_v2.3.48.docx</w:t>
             </w:r>
           </w:p>
         </w:tc>
@@ -7328,11 +7265,7 @@
           </w:tcPr>
           <w:p>
             <w:r>
-              <w:rPr>
-                <w:rFonts w:ascii="Liberation Sans" w:hAnsi="Liberation Sans"/>
-                <w:sz w:val="17"/>
-              </w:rPr>
-              <w:t>Bestanden (480 Dateien)</w:t>
+              <w:t>Bestanden (486 Dateien)</w:t>
             </w:r>
           </w:p>
         </w:tc>
@@ -7395,7 +7328,7 @@
         <w:jc w:val="center"/>
       </w:pPr>
       <w:r>
-        <w:t>Zielstand: AnniversaryAchievements v2.3.48 (Nachkorrektur der Rare-Namenslokalisierung, Versionsnummer unverändert)</w:t>
+        <w:t>Zielstand: AnniversaryAchievements v2.3.48 (Classic-Rare-Serie, vollständige Rare-Namenslokalisierung und neue Kataloglisten; Versionsnummer unverändert)</w:t>
       </w:r>
     </w:p>
     <w:p>
@@ -9016,10 +8949,7 @@
           </w:tcPr>
           <w:p>
             <w:r>
-              <w:rPr>
-                <w:sz w:val="16"/>
-              </w:rPr>
-              <w:t>CHANGELOGS/CHANGELOG_v2.3.48.docx</w:t>
+              <w:t>changelogs/CHANGELOG_v2.3.48.docx</w:t>
             </w:r>
           </w:p>
         </w:tc>
@@ -9057,6 +8987,99 @@
       </w:r>
       <w:r>
         <w:t>statische Prüfungen und Mock-Laufzeittests bestanden; ein Live-Test im WoW-Client wurde nicht durchgeführt.</w:t>
+      </w:r>
+    </w:p>
+    <w:p>
+      <w:pPr>
+        <w:pStyle w:val="Heading1"/>
+      </w:pPr>
+      <w:r>
+        <w:t>16. Ergänzung innerhalb v2.3.48: zweisprachige Kataloglisten und Verzeichnisnormalisierung</w:t>
+      </w:r>
+    </w:p>
+    <w:p>
+      <w:pPr>
+        <w:pStyle w:val="Heading2"/>
+      </w:pPr>
+      <w:r>
+        <w:t>Listen und Verzeichnisnamen</w:t>
+      </w:r>
+    </w:p>
+    <w:p>
+      <w:pPr>
+        <w:pStyle w:val="ListBullet"/>
+      </w:pPr>
+      <w:r>
+        <w:t>lists/achievements_classic_deDE.txt und lists/achievements_classic_enUS.txt enthalten die im Classic-Client definierten Erfolge im Format ID; Name; Description; Icon.</w:t>
+      </w:r>
+    </w:p>
+    <w:p>
+      <w:pPr>
+        <w:pStyle w:val="ListBullet"/>
+      </w:pPr>
+      <w:r>
+        <w:t>lists/achievements_tbc_deDE.txt und lists/achievements_tbc_enUS.txt ersetzen die bisherige allgemeine Erfolgsliste und verwenden dasselbe vierfeldrige Format.</w:t>
+      </w:r>
+    </w:p>
+    <w:p>
+      <w:pPr>
+        <w:pStyle w:val="ListBullet"/>
+      </w:pPr>
+      <w:r>
+        <w:t>lists/titles_deDE.txt ersetzt title.txt; lists/titles_enUS.txt ergänzt die entsprechende englische Titelliste.</w:t>
+      </w:r>
+    </w:p>
+    <w:p>
+      <w:pPr>
+        <w:pStyle w:val="ListBullet"/>
+      </w:pPr>
+      <w:r>
+        <w:t>Die Verzeichnisse CHANGELOGS, Documentation und Lists wurden in changelogs, documentation und lists umbenannt. Der Verweis in CHANGELOG.txt wurde entsprechend korrigiert.</w:t>
+      </w:r>
+    </w:p>
+    <w:p>
+      <w:pPr>
+        <w:pStyle w:val="Heading2"/>
+      </w:pPr>
+      <w:r>
+        <w:t>Geänderte Dateien</w:t>
+      </w:r>
+    </w:p>
+    <w:p>
+      <w:pPr>
+        <w:pStyle w:val="ListBullet"/>
+      </w:pPr>
+      <w:r>
+        <w:t>lists/achievements_classic_deDE.txt und lists/achievements_classic_enUS.txt</w:t>
+      </w:r>
+    </w:p>
+    <w:p>
+      <w:pPr>
+        <w:pStyle w:val="ListBullet"/>
+      </w:pPr>
+      <w:r>
+        <w:t>lists/achievements_tbc_deDE.txt und lists/achievements_tbc_enUS.txt</w:t>
+      </w:r>
+    </w:p>
+    <w:p>
+      <w:pPr>
+        <w:pStyle w:val="ListBullet"/>
+      </w:pPr>
+      <w:r>
+        <w:t>lists/titles_deDE.txt und lists/titles_enUS.txt</w:t>
+      </w:r>
+    </w:p>
+    <w:p>
+      <w:pPr>
+        <w:pStyle w:val="ListBullet"/>
+      </w:pPr>
+      <w:r>
+        <w:t>CHANGELOG.txt sowie die Verzeichnisnamen changelogs, documentation und lists</w:t>
+      </w:r>
+    </w:p>
+    <w:p>
+      <w:r>
+        <w:t>Freigabestatus: statische Katalog-, Lokalisierungs-, ID-, Listen- und Archivprüfungen bestanden; ein Live-Test im WoW-Client wurde nicht durchgeführt.</w:t>
       </w:r>
     </w:p>
     <w:sectPr>

</xml_diff>